<commit_message>
SAFE: add signature-block fill-in fields
Tokenized the empty investor/company signature cells (회사명, 주소,
사업자등록번호, 전화) by scanning the two blocks in document order with a
moving cursor, so repeated labels (특히 주소) land in the right block. Verified
all 23 tokens (s1–s23) occur exactly the expected number of times, and that the
template still parses (130 blocks) and fills.

Added the 8 signature fields to lib/safe-fields.ts (investor + company).

Co-Authored-By: Claude Opus 4.8 <noreply@anthropic.com>
</commit_message>
<xml_diff>
--- a/templates/safe-agreement.docx
+++ b/templates/safe-agreement.docx
@@ -1923,6 +1923,7 @@
               <w:rPr>
                 <w:rtl w:val="0"/>
               </w:rPr>
+              <w:t xml:space="preserve">{{s16}}</w:t>
             </w:r>
           </w:p>
         </w:tc>
@@ -2060,6 +2061,7 @@
               <w:rPr>
                 <w:rtl w:val="0"/>
               </w:rPr>
+              <w:t xml:space="preserve">{{s17}}</w:t>
             </w:r>
           </w:p>
         </w:tc>
@@ -2211,6 +2213,7 @@
               <w:rPr>
                 <w:rtl w:val="0"/>
               </w:rPr>
+              <w:t xml:space="preserve">{{s18}}</w:t>
             </w:r>
           </w:p>
         </w:tc>
@@ -2267,6 +2270,7 @@
               <w:rPr>
                 <w:rtl w:val="0"/>
               </w:rPr>
+              <w:t xml:space="preserve">{{s19}}</w:t>
             </w:r>
           </w:p>
         </w:tc>
@@ -3084,6 +3088,7 @@
               <w:rPr>
                 <w:rtl w:val="0"/>
               </w:rPr>
+              <w:t xml:space="preserve">{{s20}}</w:t>
             </w:r>
           </w:p>
         </w:tc>
@@ -3221,6 +3226,7 @@
               <w:rPr>
                 <w:rtl w:val="0"/>
               </w:rPr>
+              <w:t xml:space="preserve">{{s21}}</w:t>
             </w:r>
           </w:p>
         </w:tc>
@@ -3372,6 +3378,7 @@
               <w:rPr>
                 <w:rtl w:val="0"/>
               </w:rPr>
+              <w:t xml:space="preserve">{{s22}}</w:t>
             </w:r>
           </w:p>
         </w:tc>
@@ -3428,6 +3435,7 @@
               <w:rPr>
                 <w:rtl w:val="0"/>
               </w:rPr>
+              <w:t xml:space="preserve">{{s23}}</w:t>
             </w:r>
           </w:p>
         </w:tc>

</xml_diff>

<commit_message>
SAFE: add appendix-3 non-compete fields (period, penalties) - 26 tokens
</commit_message>
<xml_diff>
--- a/templates/safe-agreement.docx
+++ b/templates/safe-agreement.docx
@@ -6836,7 +6836,7 @@
           <w:highlight w:val="yellow"/>
           <w:rtl w:val="0"/>
         </w:rPr>
-        <w:t xml:space="preserve">[*]</w:t>
+        <w:t xml:space="preserve">{{s26}}</w:t>
       </w:r>
       <w:r>
         <w:rPr>
@@ -7357,7 +7357,7 @@
         <w:rPr>
           <w:rtl w:val="0"/>
         </w:rPr>
-        <w:t xml:space="preserve">② 경업금지의무자는 회사를 퇴사한 날로부터 [2]년의 기간 동안 투자자 및 회사의 동의 없이는 회사의 영업부류와 동일 또는 유사한 영업부류의 기업의 무한책임사원, 이사, 피용자가 될 수 없다. </w:t>
+        <w:t xml:space="preserve">② 경업금지의무자는 회사를 퇴사한 날로부터 {{s24}}년의 기간 동안 투자자 및 회사의 동의 없이는 회사의 영업부류와 동일 또는 유사한 영업부류의 기업의 무한책임사원, 이사, 피용자가 될 수 없다. </w:t>
       </w:r>
     </w:p>
     <w:p>
@@ -7385,7 +7385,7 @@
         <w:rPr>
           <w:rtl w:val="0"/>
         </w:rPr>
-        <w:t xml:space="preserve">경업금지의무자는 회사에 재직하는 기간 동안 및 회사를 퇴사한 날로부터 [2]년의 기간 동안 투자자 및 회사의 동의 없이는 자기 또는 제3자의 계산으로 회사의 영업부류와 동일 또는 유사한 영업부류에 속하는 거래를 하거나 기업을 운영할 수 없다. </w:t>
+        <w:t xml:space="preserve">경업금지의무자는 회사에 재직하는 기간 동안 및 회사를 퇴사한 날로부터 {{s24}}년의 기간 동안 투자자 및 회사의 동의 없이는 자기 또는 제3자의 계산으로 회사의 영업부류와 동일 또는 유사한 영업부류에 속하는 거래를 하거나 기업을 운영할 수 없다. </w:t>
       </w:r>
     </w:p>
     <w:p>
@@ -7451,7 +7451,7 @@
         <w:rPr>
           <w:rtl w:val="0"/>
         </w:rPr>
-        <w:t xml:space="preserve">① 경업금지의무자가 본 약정을 위반하는 경우 경업을 함으로써 취득한 금원 내지 증권이 있는 경우에는 해당 금원 내지 증권을 투자자 또는 회사에게 지급 또는 교부하여야 하고, 이러한 금원 내지 증권이 금 [50,000,000]원에 못 미치는 경우 그 차액을, 경업을 함으로써 취득한 금원 내지 증권이 없는 경우에는 금 [50,000,000]원을 투자자 또는 회사에게 위약벌로서 지급하여야 한다. </w:t>
+        <w:t xml:space="preserve">① 경업금지의무자가 본 약정을 위반하는 경우 경업을 함으로써 취득한 금원 내지 증권이 있는 경우에는 해당 금원 내지 증권을 투자자 또는 회사에게 지급 또는 교부하여야 하고, 이러한 금원 내지 증권이 금 {{s25}}원에 못 미치는 경우 그 차액을, 경업을 함으로써 취득한 금원 내지 증권이 없는 경우에는 금 {{s25}}원을 투자자 또는 회사에게 위약벌로서 지급하여야 한다. </w:t>
       </w:r>
     </w:p>
     <w:p>

</xml_diff>